<commit_message>
Add I Need Save and I Need Barcode to the projects section and Instagram highlights
- Two new project cards (mockup image, logo, category and description) with
  texts translated into every site language
- Instagram highlight covers and stories 26 and 27, and the updated guide

Co-Authored-By: Claude Sonnet 5.5 <noreply@anthropic.com>
</commit_message>
<xml_diff>
--- a/instagram-highlights/Panduan-Sorotan-Instagram-Nocoding.docx
+++ b/instagram-highlights/Panduan-Sorotan-Instagram-Nocoding.docx
@@ -46,7 +46,7 @@
           <w:sz w:val="24"/>
           <w:szCs w:val="24"/>
         </w:rPr>
-        <w:t xml:space="preserve">1 project = 1 sorotan = 1 story. Cover dan story untuk 25 project.</w:t>
+        <w:t xml:space="preserve">1 project = 1 sorotan = 1 story. Cover dan story untuk 27 project.</w:t>
       </w:r>
     </w:p>
     <w:p>
@@ -143,7 +143,7 @@
           <w:sz w:val="22"/>
           <w:szCs w:val="22"/>
         </w:rPr>
-        <w:t xml:space="preserve"> di folder folder cover ada 25 gambar 1080 × 1920 px. Unggah satu per sorotan lewat Sorotan &gt; Edit sampul &gt; pilih dari galeri. Logo sudah berada di tengah, jadi tidak terpotong lingkaran Instagram.</w:t>
+        <w:t xml:space="preserve"> di folder folder cover ada 27 gambar 1080 × 1920 px. Unggah satu per sorotan lewat Sorotan &gt; Edit sampul &gt; pilih dari galeri. Logo sudah berada di tengah, jadi tidak terpotong lingkaran Instagram.</w:t>
       </w:r>
     </w:p>
     <w:p>
@@ -4076,6 +4076,296 @@
           </w:p>
         </w:tc>
       </w:tr>
+      <w:tr>
+        <w:trPr>
+          <w:cantSplit/>
+        </w:trPr>
+        <w:tc>
+          <w:tcPr>
+            <w:tcW w:type="dxa" w:w="600"/>
+            <w:tcBorders>
+              <w:top w:val="single" w:color="CBD5E1" w:sz="4"/>
+              <w:left w:val="single" w:color="CBD5E1" w:sz="4"/>
+              <w:bottom w:val="single" w:color="CBD5E1" w:sz="4"/>
+              <w:right w:val="single" w:color="CBD5E1" w:sz="4"/>
+            </w:tcBorders>
+            <w:shd w:fill="F8FAFC" w:color="auto" w:val="clear"/>
+            <w:tcMar>
+              <w:top w:type="dxa" w:w="70"/>
+              <w:left w:type="dxa" w:w="110"/>
+              <w:bottom w:type="dxa" w:w="70"/>
+              <w:right w:type="dxa" w:w="110"/>
+            </w:tcMar>
+            <w:vAlign w:val="center"/>
+          </w:tcPr>
+          <w:p>
+            <w:pPr>
+              <w:spacing w:after="30" w:line="258"/>
+            </w:pPr>
+            <w:r>
+              <w:rPr>
+                <w:rFonts w:ascii="Calibri" w:cs="Calibri" w:eastAsia="Calibri" w:hAnsi="Calibri"/>
+                <w:b/>
+                <w:bCs/>
+                <w:color w:val="1E293B"/>
+                <w:sz w:val="20"/>
+                <w:szCs w:val="20"/>
+              </w:rPr>
+              <w:t xml:space="preserve">26</w:t>
+            </w:r>
+          </w:p>
+        </w:tc>
+        <w:tc>
+          <w:tcPr>
+            <w:tcW w:type="dxa" w:w="1900"/>
+            <w:tcBorders>
+              <w:top w:val="single" w:color="CBD5E1" w:sz="4"/>
+              <w:left w:val="single" w:color="CBD5E1" w:sz="4"/>
+              <w:bottom w:val="single" w:color="CBD5E1" w:sz="4"/>
+              <w:right w:val="single" w:color="CBD5E1" w:sz="4"/>
+            </w:tcBorders>
+            <w:shd w:fill="F8FAFC" w:color="auto" w:val="clear"/>
+            <w:tcMar>
+              <w:top w:type="dxa" w:w="70"/>
+              <w:left w:type="dxa" w:w="110"/>
+              <w:bottom w:type="dxa" w:w="70"/>
+              <w:right w:type="dxa" w:w="110"/>
+            </w:tcMar>
+            <w:vAlign w:val="center"/>
+          </w:tcPr>
+          <w:p>
+            <w:pPr>
+              <w:spacing w:after="30" w:line="258"/>
+            </w:pPr>
+            <w:r>
+              <w:rPr>
+                <w:rFonts w:ascii="Calibri" w:cs="Calibri" w:eastAsia="Calibri" w:hAnsi="Calibri"/>
+                <w:b w:val="false"/>
+                <w:bCs w:val="false"/>
+                <w:color w:val="1E293B"/>
+                <w:sz w:val="20"/>
+                <w:szCs w:val="20"/>
+              </w:rPr>
+              <w:t xml:space="preserve">I Need Save</w:t>
+            </w:r>
+          </w:p>
+        </w:tc>
+        <w:tc>
+          <w:tcPr>
+            <w:tcW w:type="dxa" w:w="4138"/>
+            <w:tcBorders>
+              <w:top w:val="single" w:color="CBD5E1" w:sz="4"/>
+              <w:left w:val="single" w:color="CBD5E1" w:sz="4"/>
+              <w:bottom w:val="single" w:color="CBD5E1" w:sz="4"/>
+              <w:right w:val="single" w:color="CBD5E1" w:sz="4"/>
+            </w:tcBorders>
+            <w:shd w:fill="F8FAFC" w:color="auto" w:val="clear"/>
+            <w:tcMar>
+              <w:top w:type="dxa" w:w="70"/>
+              <w:left w:type="dxa" w:w="110"/>
+              <w:bottom w:type="dxa" w:w="70"/>
+              <w:right w:type="dxa" w:w="110"/>
+            </w:tcMar>
+            <w:vAlign w:val="center"/>
+          </w:tcPr>
+          <w:p>
+            <w:pPr>
+              <w:spacing w:after="30" w:line="258"/>
+            </w:pPr>
+            <w:r>
+              <w:rPr>
+                <w:rFonts w:ascii="Calibri" w:cs="Calibri" w:eastAsia="Calibri" w:hAnsi="Calibri"/>
+                <w:b w:val="false"/>
+                <w:bCs w:val="false"/>
+                <w:color w:val="1E293B"/>
+                <w:sz w:val="20"/>
+                <w:szCs w:val="20"/>
+              </w:rPr>
+              <w:t xml:space="preserve">I Need Save</w:t>
+            </w:r>
+          </w:p>
+        </w:tc>
+        <w:tc>
+          <w:tcPr>
+            <w:tcW w:type="dxa" w:w="3000"/>
+            <w:tcBorders>
+              <w:top w:val="single" w:color="CBD5E1" w:sz="4"/>
+              <w:left w:val="single" w:color="CBD5E1" w:sz="4"/>
+              <w:bottom w:val="single" w:color="CBD5E1" w:sz="4"/>
+              <w:right w:val="single" w:color="CBD5E1" w:sz="4"/>
+            </w:tcBorders>
+            <w:shd w:fill="F8FAFC" w:color="auto" w:val="clear"/>
+            <w:tcMar>
+              <w:top w:type="dxa" w:w="70"/>
+              <w:left w:type="dxa" w:w="110"/>
+              <w:bottom w:type="dxa" w:w="70"/>
+              <w:right w:type="dxa" w:w="110"/>
+            </w:tcMar>
+            <w:vAlign w:val="center"/>
+          </w:tcPr>
+          <w:p>
+            <w:pPr>
+              <w:spacing w:after="30" w:line="258"/>
+            </w:pPr>
+            <w:r>
+              <w:rPr>
+                <w:rFonts w:ascii="Calibri" w:cs="Calibri" w:eastAsia="Calibri" w:hAnsi="Calibri"/>
+                <w:b w:val="false"/>
+                <w:bCs w:val="false"/>
+                <w:color w:val="1E293B"/>
+                <w:sz w:val="20"/>
+                <w:szCs w:val="20"/>
+              </w:rPr>
+              <w:t xml:space="preserve">26-i-need-save.png</w:t>
+            </w:r>
+          </w:p>
+        </w:tc>
+      </w:tr>
+      <w:tr>
+        <w:trPr>
+          <w:cantSplit/>
+        </w:trPr>
+        <w:tc>
+          <w:tcPr>
+            <w:tcW w:type="dxa" w:w="600"/>
+            <w:tcBorders>
+              <w:top w:val="single" w:color="CBD5E1" w:sz="4"/>
+              <w:left w:val="single" w:color="CBD5E1" w:sz="4"/>
+              <w:bottom w:val="single" w:color="CBD5E1" w:sz="4"/>
+              <w:right w:val="single" w:color="CBD5E1" w:sz="4"/>
+            </w:tcBorders>
+            <w:shd w:fill="FFFFFF" w:color="auto" w:val="clear"/>
+            <w:tcMar>
+              <w:top w:type="dxa" w:w="70"/>
+              <w:left w:type="dxa" w:w="110"/>
+              <w:bottom w:type="dxa" w:w="70"/>
+              <w:right w:type="dxa" w:w="110"/>
+            </w:tcMar>
+            <w:vAlign w:val="center"/>
+          </w:tcPr>
+          <w:p>
+            <w:pPr>
+              <w:spacing w:after="30" w:line="258"/>
+            </w:pPr>
+            <w:r>
+              <w:rPr>
+                <w:rFonts w:ascii="Calibri" w:cs="Calibri" w:eastAsia="Calibri" w:hAnsi="Calibri"/>
+                <w:b/>
+                <w:bCs/>
+                <w:color w:val="1E293B"/>
+                <w:sz w:val="20"/>
+                <w:szCs w:val="20"/>
+              </w:rPr>
+              <w:t xml:space="preserve">27</w:t>
+            </w:r>
+          </w:p>
+        </w:tc>
+        <w:tc>
+          <w:tcPr>
+            <w:tcW w:type="dxa" w:w="1900"/>
+            <w:tcBorders>
+              <w:top w:val="single" w:color="CBD5E1" w:sz="4"/>
+              <w:left w:val="single" w:color="CBD5E1" w:sz="4"/>
+              <w:bottom w:val="single" w:color="CBD5E1" w:sz="4"/>
+              <w:right w:val="single" w:color="CBD5E1" w:sz="4"/>
+            </w:tcBorders>
+            <w:shd w:fill="FFFFFF" w:color="auto" w:val="clear"/>
+            <w:tcMar>
+              <w:top w:type="dxa" w:w="70"/>
+              <w:left w:type="dxa" w:w="110"/>
+              <w:bottom w:type="dxa" w:w="70"/>
+              <w:right w:type="dxa" w:w="110"/>
+            </w:tcMar>
+            <w:vAlign w:val="center"/>
+          </w:tcPr>
+          <w:p>
+            <w:pPr>
+              <w:spacing w:after="30" w:line="258"/>
+            </w:pPr>
+            <w:r>
+              <w:rPr>
+                <w:rFonts w:ascii="Calibri" w:cs="Calibri" w:eastAsia="Calibri" w:hAnsi="Calibri"/>
+                <w:b w:val="false"/>
+                <w:bCs w:val="false"/>
+                <w:color w:val="1E293B"/>
+                <w:sz w:val="20"/>
+                <w:szCs w:val="20"/>
+              </w:rPr>
+              <w:t xml:space="preserve">I Need Barcode</w:t>
+            </w:r>
+          </w:p>
+        </w:tc>
+        <w:tc>
+          <w:tcPr>
+            <w:tcW w:type="dxa" w:w="4138"/>
+            <w:tcBorders>
+              <w:top w:val="single" w:color="CBD5E1" w:sz="4"/>
+              <w:left w:val="single" w:color="CBD5E1" w:sz="4"/>
+              <w:bottom w:val="single" w:color="CBD5E1" w:sz="4"/>
+              <w:right w:val="single" w:color="CBD5E1" w:sz="4"/>
+            </w:tcBorders>
+            <w:shd w:fill="FFFFFF" w:color="auto" w:val="clear"/>
+            <w:tcMar>
+              <w:top w:type="dxa" w:w="70"/>
+              <w:left w:type="dxa" w:w="110"/>
+              <w:bottom w:type="dxa" w:w="70"/>
+              <w:right w:type="dxa" w:w="110"/>
+            </w:tcMar>
+            <w:vAlign w:val="center"/>
+          </w:tcPr>
+          <w:p>
+            <w:pPr>
+              <w:spacing w:after="30" w:line="258"/>
+            </w:pPr>
+            <w:r>
+              <w:rPr>
+                <w:rFonts w:ascii="Calibri" w:cs="Calibri" w:eastAsia="Calibri" w:hAnsi="Calibri"/>
+                <w:b w:val="false"/>
+                <w:bCs w:val="false"/>
+                <w:color w:val="1E293B"/>
+                <w:sz w:val="20"/>
+                <w:szCs w:val="20"/>
+              </w:rPr>
+              <w:t xml:space="preserve">I Need Barcode</w:t>
+            </w:r>
+          </w:p>
+        </w:tc>
+        <w:tc>
+          <w:tcPr>
+            <w:tcW w:type="dxa" w:w="3000"/>
+            <w:tcBorders>
+              <w:top w:val="single" w:color="CBD5E1" w:sz="4"/>
+              <w:left w:val="single" w:color="CBD5E1" w:sz="4"/>
+              <w:bottom w:val="single" w:color="CBD5E1" w:sz="4"/>
+              <w:right w:val="single" w:color="CBD5E1" w:sz="4"/>
+            </w:tcBorders>
+            <w:shd w:fill="FFFFFF" w:color="auto" w:val="clear"/>
+            <w:tcMar>
+              <w:top w:type="dxa" w:w="70"/>
+              <w:left w:type="dxa" w:w="110"/>
+              <w:bottom w:type="dxa" w:w="70"/>
+              <w:right w:type="dxa" w:w="110"/>
+            </w:tcMar>
+            <w:vAlign w:val="center"/>
+          </w:tcPr>
+          <w:p>
+            <w:pPr>
+              <w:spacing w:after="30" w:line="258"/>
+            </w:pPr>
+            <w:r>
+              <w:rPr>
+                <w:rFonts w:ascii="Calibri" w:cs="Calibri" w:eastAsia="Calibri" w:hAnsi="Calibri"/>
+                <w:b w:val="false"/>
+                <w:bCs w:val="false"/>
+                <w:color w:val="1E293B"/>
+                <w:sz w:val="20"/>
+                <w:szCs w:val="20"/>
+              </w:rPr>
+              <w:t xml:space="preserve">27-i-need-barcode.png</w:t>
+            </w:r>
+          </w:p>
+        </w:tc>
+      </w:tr>
     </w:tbl>
     <w:p>
       <w:pPr>
@@ -8717,6 +9007,360 @@
                 <w:szCs w:val="20"/>
               </w:rPr>
               <w:t xml:space="preserve">Label: Aplikasi pinjaman digital</w:t>
+            </w:r>
+          </w:p>
+        </w:tc>
+      </w:tr>
+      <w:tr>
+        <w:trPr>
+          <w:cantSplit/>
+        </w:trPr>
+        <w:tc>
+          <w:tcPr>
+            <w:tcW w:type="dxa" w:w="550"/>
+            <w:tcBorders>
+              <w:top w:val="single" w:color="CBD5E1" w:sz="4"/>
+              <w:left w:val="single" w:color="CBD5E1" w:sz="4"/>
+              <w:bottom w:val="single" w:color="CBD5E1" w:sz="4"/>
+              <w:right w:val="single" w:color="CBD5E1" w:sz="4"/>
+            </w:tcBorders>
+            <w:shd w:fill="F8FAFC" w:color="auto" w:val="clear"/>
+            <w:tcMar>
+              <w:top w:type="dxa" w:w="70"/>
+              <w:left w:type="dxa" w:w="110"/>
+              <w:bottom w:type="dxa" w:w="70"/>
+              <w:right w:type="dxa" w:w="110"/>
+            </w:tcMar>
+            <w:vAlign w:val="center"/>
+          </w:tcPr>
+          <w:p>
+            <w:pPr>
+              <w:spacing w:after="30" w:line="258"/>
+            </w:pPr>
+            <w:r>
+              <w:rPr>
+                <w:rFonts w:ascii="Calibri" w:cs="Calibri" w:eastAsia="Calibri" w:hAnsi="Calibri"/>
+                <w:b/>
+                <w:bCs/>
+                <w:color w:val="1E293B"/>
+                <w:sz w:val="20"/>
+                <w:szCs w:val="20"/>
+              </w:rPr>
+              <w:t xml:space="preserve">26</w:t>
+            </w:r>
+          </w:p>
+        </w:tc>
+        <w:tc>
+          <w:tcPr>
+            <w:tcW w:type="dxa" w:w="1700"/>
+            <w:tcBorders>
+              <w:top w:val="single" w:color="CBD5E1" w:sz="4"/>
+              <w:left w:val="single" w:color="CBD5E1" w:sz="4"/>
+              <w:bottom w:val="single" w:color="CBD5E1" w:sz="4"/>
+              <w:right w:val="single" w:color="CBD5E1" w:sz="4"/>
+            </w:tcBorders>
+            <w:shd w:fill="F8FAFC" w:color="auto" w:val="clear"/>
+            <w:tcMar>
+              <w:top w:type="dxa" w:w="70"/>
+              <w:left w:type="dxa" w:w="110"/>
+              <w:bottom w:type="dxa" w:w="70"/>
+              <w:right w:type="dxa" w:w="110"/>
+            </w:tcMar>
+            <w:vAlign w:val="center"/>
+          </w:tcPr>
+          <w:p>
+            <w:pPr>
+              <w:spacing w:after="30" w:line="258"/>
+            </w:pPr>
+            <w:r>
+              <w:rPr>
+                <w:rFonts w:ascii="Calibri" w:cs="Calibri" w:eastAsia="Calibri" w:hAnsi="Calibri"/>
+                <w:b w:val="false"/>
+                <w:bCs w:val="false"/>
+                <w:color w:val="1E293B"/>
+                <w:sz w:val="20"/>
+                <w:szCs w:val="20"/>
+              </w:rPr>
+              <w:t xml:space="preserve">I Need Save</w:t>
+            </w:r>
+          </w:p>
+        </w:tc>
+        <w:tc>
+          <w:tcPr>
+            <w:tcW w:type="dxa" w:w="2300"/>
+            <w:tcBorders>
+              <w:top w:val="single" w:color="CBD5E1" w:sz="4"/>
+              <w:left w:val="single" w:color="CBD5E1" w:sz="4"/>
+              <w:bottom w:val="single" w:color="CBD5E1" w:sz="4"/>
+              <w:right w:val="single" w:color="CBD5E1" w:sz="4"/>
+            </w:tcBorders>
+            <w:shd w:fill="F8FAFC" w:color="auto" w:val="clear"/>
+            <w:tcMar>
+              <w:top w:type="dxa" w:w="70"/>
+              <w:left w:type="dxa" w:w="110"/>
+              <w:bottom w:type="dxa" w:w="70"/>
+              <w:right w:type="dxa" w:w="110"/>
+            </w:tcMar>
+            <w:vAlign w:val="center"/>
+          </w:tcPr>
+          <w:p>
+            <w:pPr>
+              <w:spacing w:after="30" w:line="258"/>
+            </w:pPr>
+            <w:r>
+              <w:rPr>
+                <w:rFonts w:ascii="Calibri" w:cs="Calibri" w:eastAsia="Calibri" w:hAnsi="Calibri"/>
+                <w:b w:val="false"/>
+                <w:bCs w:val="false"/>
+                <w:color w:val="1E293B"/>
+                <w:sz w:val="20"/>
+                <w:szCs w:val="20"/>
+              </w:rPr>
+              <w:t xml:space="preserve">story/26-i-need-save.png</w:t>
+            </w:r>
+          </w:p>
+        </w:tc>
+        <w:tc>
+          <w:tcPr>
+            <w:tcW w:type="dxa" w:w="5088"/>
+            <w:tcBorders>
+              <w:top w:val="single" w:color="CBD5E1" w:sz="4"/>
+              <w:left w:val="single" w:color="CBD5E1" w:sz="4"/>
+              <w:bottom w:val="single" w:color="CBD5E1" w:sz="4"/>
+              <w:right w:val="single" w:color="CBD5E1" w:sz="4"/>
+            </w:tcBorders>
+            <w:shd w:fill="F8FAFC" w:color="auto" w:val="clear"/>
+            <w:tcMar>
+              <w:top w:type="dxa" w:w="70"/>
+              <w:left w:type="dxa" w:w="110"/>
+              <w:bottom w:type="dxa" w:w="70"/>
+              <w:right w:type="dxa" w:w="110"/>
+            </w:tcMar>
+            <w:vAlign w:val="center"/>
+          </w:tcPr>
+          <w:p>
+            <w:pPr>
+              <w:spacing w:after="30" w:line="258"/>
+            </w:pPr>
+            <w:r>
+              <w:rPr>
+                <w:rFonts w:ascii="Calibri" w:cs="Calibri" w:eastAsia="Calibri" w:hAnsi="Calibri"/>
+                <w:b/>
+                <w:bCs/>
+                <w:color w:val="1E293B"/>
+                <w:sz w:val="20"/>
+                <w:szCs w:val="20"/>
+              </w:rPr>
+              <w:t xml:space="preserve">I Need Save</w:t>
+            </w:r>
+          </w:p>
+          <w:p>
+            <w:pPr>
+              <w:spacing w:after="30" w:line="258"/>
+            </w:pPr>
+            <w:r>
+              <w:rPr>
+                <w:rFonts w:ascii="Calibri" w:cs="Calibri" w:eastAsia="Calibri" w:hAnsi="Calibri"/>
+                <w:b w:val="false"/>
+                <w:bCs w:val="false"/>
+                <w:color w:val="1E293B"/>
+                <w:sz w:val="20"/>
+                <w:szCs w:val="20"/>
+              </w:rPr>
+              <w:t xml:space="preserve">Website gratis untuk mengunduh video, foto, dan audio dari TikTok, Instagram, Facebook, X, dan platform lain. Cukup tempel link, pilih kualitas, lalu simpan.</w:t>
+            </w:r>
+          </w:p>
+          <w:p>
+            <w:pPr>
+              <w:spacing w:after="30" w:line="258"/>
+            </w:pPr>
+            <w:r>
+              <w:rPr>
+                <w:rFonts w:ascii="Calibri" w:cs="Calibri" w:eastAsia="Calibri" w:hAnsi="Calibri"/>
+                <w:b w:val="false"/>
+                <w:bCs w:val="false"/>
+                <w:color w:val="1E293B"/>
+                <w:sz w:val="20"/>
+                <w:szCs w:val="20"/>
+              </w:rPr>
+              <w:t xml:space="preserve">Label: Website pengunduh media sosial</w:t>
+            </w:r>
+          </w:p>
+        </w:tc>
+      </w:tr>
+      <w:tr>
+        <w:trPr>
+          <w:cantSplit/>
+        </w:trPr>
+        <w:tc>
+          <w:tcPr>
+            <w:tcW w:type="dxa" w:w="550"/>
+            <w:tcBorders>
+              <w:top w:val="single" w:color="CBD5E1" w:sz="4"/>
+              <w:left w:val="single" w:color="CBD5E1" w:sz="4"/>
+              <w:bottom w:val="single" w:color="CBD5E1" w:sz="4"/>
+              <w:right w:val="single" w:color="CBD5E1" w:sz="4"/>
+            </w:tcBorders>
+            <w:shd w:fill="FFFFFF" w:color="auto" w:val="clear"/>
+            <w:tcMar>
+              <w:top w:type="dxa" w:w="70"/>
+              <w:left w:type="dxa" w:w="110"/>
+              <w:bottom w:type="dxa" w:w="70"/>
+              <w:right w:type="dxa" w:w="110"/>
+            </w:tcMar>
+            <w:vAlign w:val="center"/>
+          </w:tcPr>
+          <w:p>
+            <w:pPr>
+              <w:spacing w:after="30" w:line="258"/>
+            </w:pPr>
+            <w:r>
+              <w:rPr>
+                <w:rFonts w:ascii="Calibri" w:cs="Calibri" w:eastAsia="Calibri" w:hAnsi="Calibri"/>
+                <w:b/>
+                <w:bCs/>
+                <w:color w:val="1E293B"/>
+                <w:sz w:val="20"/>
+                <w:szCs w:val="20"/>
+              </w:rPr>
+              <w:t xml:space="preserve">27</w:t>
+            </w:r>
+          </w:p>
+        </w:tc>
+        <w:tc>
+          <w:tcPr>
+            <w:tcW w:type="dxa" w:w="1700"/>
+            <w:tcBorders>
+              <w:top w:val="single" w:color="CBD5E1" w:sz="4"/>
+              <w:left w:val="single" w:color="CBD5E1" w:sz="4"/>
+              <w:bottom w:val="single" w:color="CBD5E1" w:sz="4"/>
+              <w:right w:val="single" w:color="CBD5E1" w:sz="4"/>
+            </w:tcBorders>
+            <w:shd w:fill="FFFFFF" w:color="auto" w:val="clear"/>
+            <w:tcMar>
+              <w:top w:type="dxa" w:w="70"/>
+              <w:left w:type="dxa" w:w="110"/>
+              <w:bottom w:type="dxa" w:w="70"/>
+              <w:right w:type="dxa" w:w="110"/>
+            </w:tcMar>
+            <w:vAlign w:val="center"/>
+          </w:tcPr>
+          <w:p>
+            <w:pPr>
+              <w:spacing w:after="30" w:line="258"/>
+            </w:pPr>
+            <w:r>
+              <w:rPr>
+                <w:rFonts w:ascii="Calibri" w:cs="Calibri" w:eastAsia="Calibri" w:hAnsi="Calibri"/>
+                <w:b w:val="false"/>
+                <w:bCs w:val="false"/>
+                <w:color w:val="1E293B"/>
+                <w:sz w:val="20"/>
+                <w:szCs w:val="20"/>
+              </w:rPr>
+              <w:t xml:space="preserve">I Need Barcode</w:t>
+            </w:r>
+          </w:p>
+        </w:tc>
+        <w:tc>
+          <w:tcPr>
+            <w:tcW w:type="dxa" w:w="2300"/>
+            <w:tcBorders>
+              <w:top w:val="single" w:color="CBD5E1" w:sz="4"/>
+              <w:left w:val="single" w:color="CBD5E1" w:sz="4"/>
+              <w:bottom w:val="single" w:color="CBD5E1" w:sz="4"/>
+              <w:right w:val="single" w:color="CBD5E1" w:sz="4"/>
+            </w:tcBorders>
+            <w:shd w:fill="FFFFFF" w:color="auto" w:val="clear"/>
+            <w:tcMar>
+              <w:top w:type="dxa" w:w="70"/>
+              <w:left w:type="dxa" w:w="110"/>
+              <w:bottom w:type="dxa" w:w="70"/>
+              <w:right w:type="dxa" w:w="110"/>
+            </w:tcMar>
+            <w:vAlign w:val="center"/>
+          </w:tcPr>
+          <w:p>
+            <w:pPr>
+              <w:spacing w:after="30" w:line="258"/>
+            </w:pPr>
+            <w:r>
+              <w:rPr>
+                <w:rFonts w:ascii="Calibri" w:cs="Calibri" w:eastAsia="Calibri" w:hAnsi="Calibri"/>
+                <w:b w:val="false"/>
+                <w:bCs w:val="false"/>
+                <w:color w:val="1E293B"/>
+                <w:sz w:val="20"/>
+                <w:szCs w:val="20"/>
+              </w:rPr>
+              <w:t xml:space="preserve">story/27-i-need-barcode.png</w:t>
+            </w:r>
+          </w:p>
+        </w:tc>
+        <w:tc>
+          <w:tcPr>
+            <w:tcW w:type="dxa" w:w="5088"/>
+            <w:tcBorders>
+              <w:top w:val="single" w:color="CBD5E1" w:sz="4"/>
+              <w:left w:val="single" w:color="CBD5E1" w:sz="4"/>
+              <w:bottom w:val="single" w:color="CBD5E1" w:sz="4"/>
+              <w:right w:val="single" w:color="CBD5E1" w:sz="4"/>
+            </w:tcBorders>
+            <w:shd w:fill="FFFFFF" w:color="auto" w:val="clear"/>
+            <w:tcMar>
+              <w:top w:type="dxa" w:w="70"/>
+              <w:left w:type="dxa" w:w="110"/>
+              <w:bottom w:type="dxa" w:w="70"/>
+              <w:right w:type="dxa" w:w="110"/>
+            </w:tcMar>
+            <w:vAlign w:val="center"/>
+          </w:tcPr>
+          <w:p>
+            <w:pPr>
+              <w:spacing w:after="30" w:line="258"/>
+            </w:pPr>
+            <w:r>
+              <w:rPr>
+                <w:rFonts w:ascii="Calibri" w:cs="Calibri" w:eastAsia="Calibri" w:hAnsi="Calibri"/>
+                <w:b/>
+                <w:bCs/>
+                <w:color w:val="1E293B"/>
+                <w:sz w:val="20"/>
+                <w:szCs w:val="20"/>
+              </w:rPr>
+              <w:t xml:space="preserve">I Need Barcode</w:t>
+            </w:r>
+          </w:p>
+          <w:p>
+            <w:pPr>
+              <w:spacing w:after="30" w:line="258"/>
+            </w:pPr>
+            <w:r>
+              <w:rPr>
+                <w:rFonts w:ascii="Calibri" w:cs="Calibri" w:eastAsia="Calibri" w:hAnsi="Calibri"/>
+                <w:b w:val="false"/>
+                <w:bCs w:val="false"/>
+                <w:color w:val="1E293B"/>
+                <w:sz w:val="20"/>
+                <w:szCs w:val="20"/>
+              </w:rPr>
+              <w:t xml:space="preserve">Generator barcode dan QR Code gratis dengan lebih dari 100 jenis barcode. Pengguna mengisi data, mengatur desain, lalu mengunduh PNG siap cetak.</w:t>
+            </w:r>
+          </w:p>
+          <w:p>
+            <w:pPr>
+              <w:spacing w:after="30" w:line="258"/>
+            </w:pPr>
+            <w:r>
+              <w:rPr>
+                <w:rFonts w:ascii="Calibri" w:cs="Calibri" w:eastAsia="Calibri" w:hAnsi="Calibri"/>
+                <w:b w:val="false"/>
+                <w:bCs w:val="false"/>
+                <w:color w:val="1E293B"/>
+                <w:sz w:val="20"/>
+                <w:szCs w:val="20"/>
+              </w:rPr>
+              <w:t xml:space="preserve">Label: Website generator barcode &amp; QR Code</w:t>
             </w:r>
           </w:p>
         </w:tc>

</xml_diff>